<commit_message>
docs: add live production Vercel URL customer-feedback-agent-orcin.vercel.app to repository documentation
</commit_message>
<xml_diff>
--- a/DEPLOYMENT_GUIDE.docx
+++ b/DEPLOYMENT_GUIDE.docx
@@ -48,7 +48,19 @@
           <w:rFonts w:ascii="Segoe UI" w:hAnsi="Segoe UI"/>
           <w:sz w:val="21"/>
         </w:rPr>
-        <w:t>This guide provides step-by-step production deployment procedures for Docker Compose, Kubernetes, PostgreSQL, Redis, and ChromaDB.</w:t>
+        <w:t xml:space="preserve">**Live Production URL**: [customer-feedback-agent-orcin.vercel.app](https://customer-feedback-agent-orcin.vercel.app/)  </w:t>
+      </w:r>
+    </w:p>
+    <w:p>
+      <w:pPr>
+        <w:spacing w:after="80" w:line="276" w:lineRule="auto"/>
+      </w:pPr>
+      <w:r>
+        <w:rPr>
+          <w:rFonts w:ascii="Segoe UI" w:hAnsi="Segoe UI"/>
+          <w:sz w:val="21"/>
+        </w:rPr>
+        <w:t>This guide provides step-by-step production deployment procedures for Vercel, Docker Compose, Kubernetes, PostgreSQL, Redis, and ChromaDB.</w:t>
       </w:r>
     </w:p>
     <w:p>

</xml_diff>